<commit_message>
fix: align portfolio claims and public resume '/Users/jeremycain/Desktop/Jeremy_Cain_Resume_Aligned.docx'
Co-Authored-By: Claude Sonnet 5 <noreply@anthropic.com>
</commit_message>
<xml_diff>
--- a/public/Jeremy_Cain_Resume.docx
+++ b/public/Jeremy_Cain_Resume.docx
@@ -4,421 +4,1005 @@
   <w:body>
     <w:p>
       <w:pPr>
-        <w:pStyle w:val="Heading1"/>
+        <w:spacing w:after="0"/>
+        <w:jc w:val="center"/>
       </w:pPr>
       <w:r>
+        <w:rPr>
+          <w:b/>
+          <w:color w:val="1A2336"/>
+          <w:sz w:val="44"/>
+        </w:rPr>
         <w:t>JEREMY CAIN</w:t>
       </w:r>
     </w:p>
     <w:p>
+      <w:pPr>
+        <w:spacing w:after="20"/>
+        <w:jc w:val="center"/>
+      </w:pPr>
       <w:r>
-        <w:t>Fort Worth, TX</w:t>
-        <w:br/>
-        <w:t>(817) 716-3808</w:t>
-        <w:br/>
-        <w:t>Jeremy.M.Cain@Hotmail.com</w:t>
-        <w:br/>
-        <w:t>LinkedIn: (Insert URL)</w:t>
-        <w:br/>
+        <w:rPr>
+          <w:b/>
+          <w:color w:val="22547E"/>
+          <w:sz w:val="21"/>
+        </w:rPr>
+        <w:t>IT OPERATIONS  |  SYSTEMS ADMINISTRATION  |  IDENTITY</w:t>
       </w:r>
     </w:p>
     <w:p>
       <w:pPr>
-        <w:pStyle w:val="Heading2"/>
+        <w:spacing w:after="80"/>
+        <w:jc w:val="center"/>
       </w:pPr>
       <w:r>
-        <w:t>IT SUPPORT SPECIALIST | SYSTEMS ADMINISTRATION | MICROSOFT 365</w:t>
-      </w:r>
-    </w:p>
-    <w:p>
-      <w:r>
-        <w:t>IT professional with 5+ years of experience supporting enterprise users, Microsoft technologies, Windows workstations, virtual desktops, mobile devices, and business-critical systems in large corporate environments. Experienced installing hardware and software, troubleshooting complex technical issues, deploying endpoints, administering Microsoft 365 and Active Directory, and maintaining accurate IT documentation.</w:t>
-        <w:br/>
-        <w:br/>
-        <w:t>Recognized for strong customer service, attention to detail, ownership of technical issues, and the ability to work independently while supporting enterprise technology operations.</w:t>
+        <w:rPr>
+          <w:color w:val="555B65"/>
+          <w:sz w:val="18"/>
+        </w:rPr>
+        <w:t>Fort Worth, TX  •  (817) 716-3808  •  jeremy@jeremymcain.com  •  jeremymcain.com</w:t>
       </w:r>
     </w:p>
     <w:p>
       <w:pPr>
-        <w:pStyle w:val="Heading2"/>
+        <w:pStyle w:val="SectionHeading"/>
+        <w:keepNext/>
+        <w:pBdr>
+          <w:bottom w:val="single" w:sz="10" w:space="1" w:color="22547E"/>
+        </w:pBdr>
       </w:pPr>
       <w:r>
-        <w:t>TECHNICAL SKILLS</w:t>
+        <w:t>PROFESSIONAL SUMMARY</w:t>
       </w:r>
     </w:p>
     <w:p>
       <w:pPr>
-        <w:pStyle w:val="ListBullet"/>
+        <w:spacing w:after="40"/>
       </w:pPr>
       <w:r>
-        <w:t>Operating Systems: Windows 10/11, Windows Server, macOS, Linux (Ubuntu/Debian)</w:t>
+        <w:rPr>
+          <w:b/>
+        </w:rPr>
+        <w:t xml:space="preserve">IT operations and systems administration professional with 8+ years of experience supporting more than 1,000 enterprise users and business-critical environments. </w:t>
+      </w:r>
+      <w:r>
+        <w:t>Hands-on experience spans Windows and Linux administration, Active Directory, Microsoft 365, endpoint management, virtualization, networking, identity, technical documentation, and complex troubleshooting. Builds and documents production-style infrastructure through enterprise support work, an independent systems lab, and a live nonprofit website platform.</w:t>
       </w:r>
     </w:p>
     <w:p>
       <w:pPr>
-        <w:pStyle w:val="ListBullet"/>
+        <w:pStyle w:val="SectionHeading"/>
+        <w:keepNext/>
+        <w:pBdr>
+          <w:bottom w:val="single" w:sz="10" w:space="1" w:color="22547E"/>
+        </w:pBdr>
       </w:pPr>
       <w:r>
-        <w:t>Microsoft Technologies: Microsoft 365, Active Directory, Microsoft Entra ID (Azure AD), Intune, Microsoft Remote Assistance</w:t>
+        <w:t>CORE TECHNOLOGIES</w:t>
       </w:r>
     </w:p>
+    <w:tbl>
+      <w:tblPr>
+        <w:tblW w:type="auto" w:w="0"/>
+        <w:jc w:val="center"/>
+        <w:tblLayout w:type="fixed"/>
+        <w:tblLook w:firstColumn="1" w:firstRow="1" w:lastColumn="0" w:lastRow="0" w:noHBand="0" w:noVBand="1" w:val="04A0"/>
+      </w:tblPr>
+      <w:tblGrid>
+        <w:gridCol w:w="5328"/>
+        <w:gridCol w:w="5328"/>
+      </w:tblGrid>
+      <w:tr>
+        <w:trPr>
+          <w:cantSplit/>
+        </w:trPr>
+        <w:tc>
+          <w:tcPr>
+            <w:tcW w:type="dxa" w:w="2088"/>
+            <w:vAlign w:val="center"/>
+          </w:tcPr>
+          <w:p>
+            <w:pPr>
+              <w:spacing w:after="0"/>
+            </w:pPr>
+            <w:r>
+              <w:rPr>
+                <w:b/>
+                <w:color w:val="1A2336"/>
+                <w:sz w:val="17"/>
+              </w:rPr>
+              <w:t>Systems &amp; Identity</w:t>
+            </w:r>
+          </w:p>
+        </w:tc>
+        <w:tc>
+          <w:tcPr>
+            <w:tcW w:type="dxa" w:w="7992"/>
+            <w:vAlign w:val="center"/>
+          </w:tcPr>
+          <w:p>
+            <w:pPr>
+              <w:spacing w:after="0"/>
+            </w:pPr>
+            <w:r>
+              <w:rPr>
+                <w:sz w:val="17"/>
+              </w:rPr>
+              <w:t>Windows 10/11, Windows Server, Active Directory, DNS, DHCP, Group Policy, Microsoft Entra ID, Microsoft 365, Intune</w:t>
+            </w:r>
+          </w:p>
+        </w:tc>
+      </w:tr>
+      <w:tr>
+        <w:trPr>
+          <w:cantSplit/>
+        </w:trPr>
+        <w:tc>
+          <w:tcPr>
+            <w:tcW w:type="dxa" w:w="2088"/>
+            <w:vAlign w:val="center"/>
+          </w:tcPr>
+          <w:p>
+            <w:pPr>
+              <w:spacing w:after="0"/>
+            </w:pPr>
+            <w:r>
+              <w:rPr>
+                <w:b/>
+                <w:color w:val="1A2336"/>
+                <w:sz w:val="17"/>
+              </w:rPr>
+              <w:t>Infrastructure</w:t>
+            </w:r>
+          </w:p>
+        </w:tc>
+        <w:tc>
+          <w:tcPr>
+            <w:tcW w:type="dxa" w:w="7992"/>
+            <w:vAlign w:val="center"/>
+          </w:tcPr>
+          <w:p>
+            <w:pPr>
+              <w:spacing w:after="0"/>
+            </w:pPr>
+            <w:r>
+              <w:rPr>
+                <w:sz w:val="17"/>
+              </w:rPr>
+              <w:t>Ubuntu, Debian, Nginx, systemd, Proxmox VE, VMware Horizon, Citrix, Windows Cloud PC, pfSense, Cisco switching, VLANs</w:t>
+            </w:r>
+          </w:p>
+        </w:tc>
+      </w:tr>
+      <w:tr>
+        <w:trPr>
+          <w:cantSplit/>
+        </w:trPr>
+        <w:tc>
+          <w:tcPr>
+            <w:tcW w:type="dxa" w:w="2088"/>
+            <w:vAlign w:val="center"/>
+          </w:tcPr>
+          <w:p>
+            <w:pPr>
+              <w:spacing w:after="0"/>
+            </w:pPr>
+            <w:r>
+              <w:rPr>
+                <w:b/>
+                <w:color w:val="1A2336"/>
+                <w:sz w:val="17"/>
+              </w:rPr>
+              <w:t>Operations &amp; Security</w:t>
+            </w:r>
+          </w:p>
+        </w:tc>
+        <w:tc>
+          <w:tcPr>
+            <w:tcW w:type="dxa" w:w="7992"/>
+            <w:vAlign w:val="center"/>
+          </w:tcPr>
+          <w:p>
+            <w:pPr>
+              <w:spacing w:after="0"/>
+            </w:pPr>
+            <w:r>
+              <w:rPr>
+                <w:sz w:val="17"/>
+              </w:rPr>
+              <w:t>ServiceNow, BMC Remedy, SCCM, BlackBerry UEM, AirWatch, Wazuh, Suricata, backup and recovery, incident documentation</w:t>
+            </w:r>
+          </w:p>
+        </w:tc>
+      </w:tr>
+      <w:tr>
+        <w:trPr>
+          <w:cantSplit/>
+        </w:trPr>
+        <w:tc>
+          <w:tcPr>
+            <w:tcW w:type="dxa" w:w="2088"/>
+            <w:vAlign w:val="center"/>
+          </w:tcPr>
+          <w:p>
+            <w:pPr>
+              <w:spacing w:after="0"/>
+            </w:pPr>
+            <w:r>
+              <w:rPr>
+                <w:b/>
+                <w:color w:val="1A2336"/>
+                <w:sz w:val="17"/>
+              </w:rPr>
+              <w:t>Scripting &amp; Platforms</w:t>
+            </w:r>
+          </w:p>
+        </w:tc>
+        <w:tc>
+          <w:tcPr>
+            <w:tcW w:type="dxa" w:w="7992"/>
+            <w:vAlign w:val="center"/>
+          </w:tcPr>
+          <w:p>
+            <w:pPr>
+              <w:spacing w:after="0"/>
+            </w:pPr>
+            <w:r>
+              <w:rPr>
+                <w:sz w:val="17"/>
+              </w:rPr>
+              <w:t>PowerShell, Bash, ASP.NET Core, .NET, Umbraco CMS, SQLite, GitHub, DNS email security (SPF, DKIM, DMARC)</w:t>
+            </w:r>
+          </w:p>
+        </w:tc>
+      </w:tr>
+    </w:tbl>
     <w:p>
       <w:pPr>
-        <w:pStyle w:val="ListBullet"/>
-      </w:pPr>
-      <w:r>
-        <w:t>Infrastructure: VMware Horizon, Citrix, Windows Cloud PC, Proxmox, DNS, DHCP, TCP/IP</w:t>
-      </w:r>
-    </w:p>
-    <w:p>
-      <w:pPr>
-        <w:pStyle w:val="ListBullet"/>
-      </w:pPr>
-      <w:r>
-        <w:t>Endpoint Support: Laptop Deployment, Desktop Deployment, Hardware Troubleshooting, Software Installation, Printer Support, Mobile Device Support</w:t>
-      </w:r>
-    </w:p>
-    <w:p>
-      <w:pPr>
-        <w:pStyle w:val="ListBullet"/>
-      </w:pPr>
-      <w:r>
-        <w:t>Mobile Device Management: Microsoft Intune, BlackBerry UEM, AirWatch</w:t>
-      </w:r>
-    </w:p>
-    <w:p>
-      <w:pPr>
-        <w:pStyle w:val="ListBullet"/>
-      </w:pPr>
-      <w:r>
-        <w:t>Enterprise Tools: ServiceNow, BMC Remedy, SCCM, Microsoft Office, PowerShell (Foundational)</w:t>
-      </w:r>
-    </w:p>
-    <w:p>
-      <w:pPr>
-        <w:pStyle w:val="Heading2"/>
+        <w:pStyle w:val="SectionHeading"/>
+        <w:keepNext/>
+        <w:pBdr>
+          <w:bottom w:val="single" w:sz="10" w:space="1" w:color="22547E"/>
+        </w:pBdr>
       </w:pPr>
       <w:r>
         <w:t>PROFESSIONAL EXPERIENCE</w:t>
       </w:r>
     </w:p>
+    <w:tbl>
+      <w:tblPr>
+        <w:tblW w:type="auto" w:w="0"/>
+        <w:jc w:val="center"/>
+        <w:tblLayout w:type="fixed"/>
+        <w:tblLook w:firstColumn="1" w:firstRow="1" w:lastColumn="0" w:lastRow="0" w:noHBand="0" w:noVBand="1" w:val="04A0"/>
+      </w:tblPr>
+      <w:tblGrid>
+        <w:gridCol w:w="7632"/>
+        <w:gridCol w:w="2448"/>
+      </w:tblGrid>
+      <w:tr>
+        <w:trPr>
+          <w:cantSplit/>
+        </w:trPr>
+        <w:tc>
+          <w:tcPr>
+            <w:tcW w:type="dxa" w:w="7632"/>
+            <w:vAlign w:val="center"/>
+          </w:tcPr>
+          <w:p>
+            <w:pPr>
+              <w:spacing w:after="0"/>
+            </w:pPr>
+            <w:r>
+              <w:rPr>
+                <w:b/>
+                <w:color w:val="1A2336"/>
+                <w:sz w:val="19"/>
+              </w:rPr>
+              <w:t>Wells Fargo | Technology Operations Associate</w:t>
+            </w:r>
+          </w:p>
+        </w:tc>
+        <w:tc>
+          <w:tcPr>
+            <w:tcW w:type="dxa" w:w="2448"/>
+            <w:vAlign w:val="center"/>
+          </w:tcPr>
+          <w:p>
+            <w:pPr>
+              <w:spacing w:after="0"/>
+              <w:jc w:val="right"/>
+            </w:pPr>
+            <w:r>
+              <w:rPr>
+                <w:b/>
+                <w:color w:val="555B65"/>
+                <w:sz w:val="18"/>
+              </w:rPr>
+              <w:t>Feb 2022 – Present</w:t>
+            </w:r>
+          </w:p>
+        </w:tc>
+      </w:tr>
+    </w:tbl>
     <w:p>
       <w:pPr>
-        <w:pStyle w:val="Heading3"/>
+        <w:spacing w:after="24"/>
+        <w:ind w:left="202" w:hanging="173"/>
       </w:pPr>
       <w:r>
-        <w:t>Wells Fargo – Technology Operations Associate</w:t>
+        <w:rPr>
+          <w:b/>
+        </w:rPr>
+        <w:t xml:space="preserve">• </w:t>
       </w:r>
-    </w:p>
-    <w:p>
       <w:r>
-        <w:t>February 2022 – Present</w:t>
+        <w:t>Support more than 1,000 internal employees across business-critical financial operations, resolving Windows, Microsoft 365, identity, virtual desktop, endpoint, and application issues.</w:t>
       </w:r>
     </w:p>
     <w:p>
       <w:pPr>
-        <w:pStyle w:val="ListBullet"/>
+        <w:spacing w:after="24"/>
+        <w:ind w:left="202" w:hanging="173"/>
       </w:pPr>
       <w:r>
-        <w:t>Provide technical support for more than 1,000 internal employees supporting business-critical financial operations.</w:t>
+        <w:rPr>
+          <w:b/>
+        </w:rPr>
+        <w:t xml:space="preserve">• </w:t>
+      </w:r>
+      <w:r>
+        <w:t>Troubleshoot Windows 10/11, VMware Horizon, Citrix Virtual Desktops, Windows Cloud PCs, authentication, hardware, software, and account access through enterprise tools and remote support.</w:t>
       </w:r>
     </w:p>
     <w:p>
       <w:pPr>
-        <w:pStyle w:val="ListBullet"/>
+        <w:spacing w:after="24"/>
+        <w:ind w:left="202" w:hanging="173"/>
       </w:pPr>
       <w:r>
-        <w:t>Troubleshoot Windows 10/11 systems, Microsoft 365, VMware Horizon, Citrix Virtual Desktops, and Windows Cloud PCs.</w:t>
+        <w:rPr>
+          <w:b/>
+        </w:rPr>
+        <w:t xml:space="preserve">• </w:t>
+      </w:r>
+      <w:r>
+        <w:t>Administer mobile endpoints through Microsoft Intune and BlackBerry UEM while maintaining security and operational standards.</w:t>
       </w:r>
     </w:p>
     <w:p>
       <w:pPr>
-        <w:pStyle w:val="ListBullet"/>
+        <w:spacing w:after="24"/>
+        <w:ind w:left="202" w:hanging="173"/>
       </w:pPr>
       <w:r>
-        <w:t>Resolve hardware, software, authentication, and account-related issues through phone, remote support, and enterprise management tools.</w:t>
+        <w:rPr>
+          <w:b/>
+        </w:rPr>
+        <w:t xml:space="preserve">• </w:t>
+      </w:r>
+      <w:r>
+        <w:t>Maintain 100% ticket quality while documenting incidents, resolutions, and technical procedures and collaborating with multiple technology teams on complex issues.</w:t>
+      </w:r>
+    </w:p>
+    <w:tbl>
+      <w:tblPr>
+        <w:tblW w:type="auto" w:w="0"/>
+        <w:jc w:val="center"/>
+        <w:tblLayout w:type="fixed"/>
+        <w:tblLook w:firstColumn="1" w:firstRow="1" w:lastColumn="0" w:lastRow="0" w:noHBand="0" w:noVBand="1" w:val="04A0"/>
+      </w:tblPr>
+      <w:tblGrid>
+        <w:gridCol w:w="7632"/>
+        <w:gridCol w:w="2448"/>
+      </w:tblGrid>
+      <w:tr>
+        <w:trPr>
+          <w:cantSplit/>
+        </w:trPr>
+        <w:tc>
+          <w:tcPr>
+            <w:tcW w:type="dxa" w:w="7632"/>
+            <w:vAlign w:val="center"/>
+          </w:tcPr>
+          <w:p>
+            <w:pPr>
+              <w:spacing w:after="0"/>
+            </w:pPr>
+            <w:r>
+              <w:rPr>
+                <w:b/>
+                <w:color w:val="1A2336"/>
+                <w:sz w:val="19"/>
+              </w:rPr>
+              <w:t>Amentum | End User Support Specialist</w:t>
+            </w:r>
+          </w:p>
+        </w:tc>
+        <w:tc>
+          <w:tcPr>
+            <w:tcW w:type="dxa" w:w="2448"/>
+            <w:vAlign w:val="center"/>
+          </w:tcPr>
+          <w:p>
+            <w:pPr>
+              <w:spacing w:after="0"/>
+              <w:jc w:val="right"/>
+            </w:pPr>
+            <w:r>
+              <w:rPr>
+                <w:b/>
+                <w:color w:val="555B65"/>
+                <w:sz w:val="18"/>
+              </w:rPr>
+              <w:t>Oct 2020 – Jun 2021</w:t>
+            </w:r>
+          </w:p>
+        </w:tc>
+      </w:tr>
+    </w:tbl>
+    <w:p>
+      <w:pPr>
+        <w:spacing w:after="24"/>
+        <w:ind w:left="202" w:hanging="173"/>
+      </w:pPr>
+      <w:r>
+        <w:rPr>
+          <w:b/>
+        </w:rPr>
+        <w:t xml:space="preserve">• </w:t>
+      </w:r>
+      <w:r>
+        <w:t>Supported more than 1,000 global employees across Windows workstations, Microsoft 365, Active Directory, enterprise applications, mobile devices, and multi-factor authentication.</w:t>
       </w:r>
     </w:p>
     <w:p>
       <w:pPr>
-        <w:pStyle w:val="ListBullet"/>
+        <w:spacing w:after="24"/>
+        <w:ind w:left="202" w:hanging="173"/>
       </w:pPr>
       <w:r>
-        <w:t>Administer Microsoft Intune and BlackBerry UEM to support enterprise mobile devices.</w:t>
+        <w:rPr>
+          <w:b/>
+        </w:rPr>
+        <w:t xml:space="preserve">• </w:t>
+      </w:r>
+      <w:r>
+        <w:t>Provisioned Active Directory and Microsoft 365 accounts with PowerShell, managed devices through AirWatch, and configured Cisco IP phones.</w:t>
+      </w:r>
+    </w:p>
+    <w:tbl>
+      <w:tblPr>
+        <w:tblW w:type="auto" w:w="0"/>
+        <w:jc w:val="center"/>
+        <w:tblLayout w:type="fixed"/>
+        <w:tblLook w:firstColumn="1" w:firstRow="1" w:lastColumn="0" w:lastRow="0" w:noHBand="0" w:noVBand="1" w:val="04A0"/>
+      </w:tblPr>
+      <w:tblGrid>
+        <w:gridCol w:w="7632"/>
+        <w:gridCol w:w="2448"/>
+      </w:tblGrid>
+      <w:tr>
+        <w:trPr>
+          <w:cantSplit/>
+        </w:trPr>
+        <w:tc>
+          <w:tcPr>
+            <w:tcW w:type="dxa" w:w="7632"/>
+            <w:vAlign w:val="center"/>
+          </w:tcPr>
+          <w:p>
+            <w:pPr>
+              <w:spacing w:after="0"/>
+            </w:pPr>
+            <w:r>
+              <w:rPr>
+                <w:b/>
+                <w:color w:val="1A2336"/>
+                <w:sz w:val="19"/>
+              </w:rPr>
+              <w:t>Bank of America | Technical Support III</w:t>
+            </w:r>
+          </w:p>
+        </w:tc>
+        <w:tc>
+          <w:tcPr>
+            <w:tcW w:type="dxa" w:w="2448"/>
+            <w:vAlign w:val="center"/>
+          </w:tcPr>
+          <w:p>
+            <w:pPr>
+              <w:spacing w:after="0"/>
+              <w:jc w:val="right"/>
+            </w:pPr>
+            <w:r>
+              <w:rPr>
+                <w:b/>
+                <w:color w:val="555B65"/>
+                <w:sz w:val="18"/>
+              </w:rPr>
+              <w:t>Apr 2020 – Oct 2020</w:t>
+            </w:r>
+          </w:p>
+        </w:tc>
+      </w:tr>
+    </w:tbl>
+    <w:p>
+      <w:pPr>
+        <w:spacing w:after="24"/>
+        <w:ind w:left="202" w:hanging="173"/>
+      </w:pPr>
+      <w:r>
+        <w:rPr>
+          <w:b/>
+        </w:rPr>
+        <w:t xml:space="preserve">• </w:t>
+      </w:r>
+      <w:r>
+        <w:t>Delivered Level II support for enterprise laptops, virtual machines, Chromebooks, business applications, and remote users using BMC Remedy and enterprise support tools.</w:t>
+      </w:r>
+    </w:p>
+    <w:tbl>
+      <w:tblPr>
+        <w:tblW w:type="auto" w:w="0"/>
+        <w:jc w:val="center"/>
+        <w:tblLayout w:type="fixed"/>
+        <w:tblLook w:firstColumn="1" w:firstRow="1" w:lastColumn="0" w:lastRow="0" w:noHBand="0" w:noVBand="1" w:val="04A0"/>
+      </w:tblPr>
+      <w:tblGrid>
+        <w:gridCol w:w="7632"/>
+        <w:gridCol w:w="2448"/>
+      </w:tblGrid>
+      <w:tr>
+        <w:trPr>
+          <w:cantSplit/>
+        </w:trPr>
+        <w:tc>
+          <w:tcPr>
+            <w:tcW w:type="dxa" w:w="7632"/>
+            <w:vAlign w:val="center"/>
+          </w:tcPr>
+          <w:p>
+            <w:pPr>
+              <w:spacing w:after="0"/>
+            </w:pPr>
+            <w:r>
+              <w:rPr>
+                <w:b/>
+                <w:color w:val="1A2336"/>
+                <w:sz w:val="19"/>
+              </w:rPr>
+              <w:t>Amynta Group | Service Desk Analyst I</w:t>
+            </w:r>
+          </w:p>
+        </w:tc>
+        <w:tc>
+          <w:tcPr>
+            <w:tcW w:type="dxa" w:w="2448"/>
+            <w:vAlign w:val="center"/>
+          </w:tcPr>
+          <w:p>
+            <w:pPr>
+              <w:spacing w:after="0"/>
+              <w:jc w:val="right"/>
+            </w:pPr>
+            <w:r>
+              <w:rPr>
+                <w:b/>
+                <w:color w:val="555B65"/>
+                <w:sz w:val="18"/>
+              </w:rPr>
+              <w:t>Jul 2018 – Mar 2020</w:t>
+            </w:r>
+          </w:p>
+        </w:tc>
+      </w:tr>
+    </w:tbl>
+    <w:p>
+      <w:pPr>
+        <w:spacing w:after="24"/>
+        <w:ind w:left="202" w:hanging="173"/>
+      </w:pPr>
+      <w:r>
+        <w:rPr>
+          <w:b/>
+        </w:rPr>
+        <w:t xml:space="preserve">• </w:t>
+      </w:r>
+      <w:r>
+        <w:t>Supported Windows desktops, Active Directory accounts, printers, and business applications; managed ServiceNow incidents and helped deploy more than 600 Windows 10 workstations.</w:t>
       </w:r>
     </w:p>
     <w:p>
       <w:pPr>
-        <w:pStyle w:val="ListBullet"/>
+        <w:spacing w:after="24"/>
+        <w:ind w:left="202" w:hanging="173"/>
       </w:pPr>
       <w:r>
-        <w:t>Install and configure approved software applications while maintaining security and operational standards.</w:t>
+        <w:rPr>
+          <w:b/>
+        </w:rPr>
+        <w:t xml:space="preserve">• </w:t>
+      </w:r>
+      <w:r>
+        <w:t>Created technical documentation that improved knowledge sharing and issue-resolution consistency.</w:t>
       </w:r>
     </w:p>
     <w:p>
       <w:pPr>
-        <w:pStyle w:val="ListBullet"/>
+        <w:pStyle w:val="SectionHeading"/>
+        <w:keepNext/>
+        <w:pageBreakBefore/>
+        <w:pBdr>
+          <w:bottom w:val="single" w:sz="10" w:space="1" w:color="22547E"/>
+        </w:pBdr>
       </w:pPr>
       <w:r>
-        <w:t>Document incidents, resolutions, and technical procedures within enterprise ticketing systems.</w:t>
+        <w:t>SELECTED INFRASTRUCTURE PROJECTS</w:t>
+      </w:r>
+    </w:p>
+    <w:tbl>
+      <w:tblPr>
+        <w:tblW w:type="auto" w:w="0"/>
+        <w:jc w:val="center"/>
+        <w:tblLayout w:type="fixed"/>
+        <w:tblLook w:firstColumn="1" w:firstRow="1" w:lastColumn="0" w:lastRow="0" w:noHBand="0" w:noVBand="1" w:val="04A0"/>
+      </w:tblPr>
+      <w:tblGrid>
+        <w:gridCol w:w="7632"/>
+        <w:gridCol w:w="2448"/>
+      </w:tblGrid>
+      <w:tr>
+        <w:trPr>
+          <w:cantSplit/>
+        </w:trPr>
+        <w:tc>
+          <w:tcPr>
+            <w:tcW w:type="dxa" w:w="7632"/>
+            <w:vAlign w:val="center"/>
+          </w:tcPr>
+          <w:p>
+            <w:pPr>
+              <w:spacing w:after="0"/>
+            </w:pPr>
+            <w:r>
+              <w:rPr>
+                <w:b/>
+                <w:color w:val="1A2336"/>
+                <w:sz w:val="19"/>
+              </w:rPr>
+              <w:t>Enterprise Infrastructure Lab | Independent Systems Administration Project</w:t>
+            </w:r>
+          </w:p>
+        </w:tc>
+        <w:tc>
+          <w:tcPr>
+            <w:tcW w:type="dxa" w:w="2448"/>
+            <w:vAlign w:val="center"/>
+          </w:tcPr>
+          <w:p>
+            <w:pPr>
+              <w:spacing w:after="0"/>
+              <w:jc w:val="right"/>
+            </w:pPr>
+            <w:r>
+              <w:rPr>
+                <w:b/>
+                <w:color w:val="555B65"/>
+                <w:sz w:val="18"/>
+              </w:rPr>
+              <w:t>Active</w:t>
+            </w:r>
+          </w:p>
+        </w:tc>
+      </w:tr>
+    </w:tbl>
+    <w:p>
+      <w:pPr>
+        <w:spacing w:after="24"/>
+        <w:ind w:left="202" w:hanging="173"/>
+      </w:pPr>
+      <w:r>
+        <w:rPr>
+          <w:b/>
+        </w:rPr>
+        <w:t xml:space="preserve">• </w:t>
+      </w:r>
+      <w:r>
+        <w:t>Designed and administer an enterprise-style environment using Windows Server 2022, Active Directory, DNS, Group Policy, PowerShell, Proxmox VE, pfSense, Cisco switching, VLANs, Wazuh, and Suricata.</w:t>
       </w:r>
     </w:p>
     <w:p>
       <w:pPr>
-        <w:pStyle w:val="ListBullet"/>
+        <w:spacing w:after="24"/>
+        <w:ind w:left="202" w:hanging="173"/>
       </w:pPr>
       <w:r>
-        <w:t>Consistently maintain a 100% ticket quality score while meeting service-level expectations.</w:t>
+        <w:rPr>
+          <w:b/>
+        </w:rPr>
+        <w:t xml:space="preserve">• </w:t>
+      </w:r>
+      <w:r>
+        <w:t>Built role-based organizational units, security groups, privileged administrative separation, domain-joined systems, network segmentation, and PowerShell health-validation tools.</w:t>
       </w:r>
     </w:p>
     <w:p>
       <w:pPr>
-        <w:pStyle w:val="ListBullet"/>
+        <w:spacing w:after="24"/>
+        <w:ind w:left="202" w:hanging="173"/>
       </w:pPr>
       <w:r>
-        <w:t>Collaborate with multiple technology teams to resolve complex issues and improve service delivery.</w:t>
+        <w:rPr>
+          <w:b/>
+        </w:rPr>
+        <w:t xml:space="preserve">• </w:t>
+      </w:r>
+      <w:r>
+        <w:t>Diagnosed DNS resolution failures, Active Directory health warnings, DFS-R events, and Linux service connectivity issues while documenting architecture and troubleshooting outcomes.</w:t>
+      </w:r>
+    </w:p>
+    <w:tbl>
+      <w:tblPr>
+        <w:tblW w:type="auto" w:w="0"/>
+        <w:jc w:val="center"/>
+        <w:tblLayout w:type="fixed"/>
+        <w:tblLook w:firstColumn="1" w:firstRow="1" w:lastColumn="0" w:lastRow="0" w:noHBand="0" w:noVBand="1" w:val="04A0"/>
+      </w:tblPr>
+      <w:tblGrid>
+        <w:gridCol w:w="7632"/>
+        <w:gridCol w:w="2448"/>
+      </w:tblGrid>
+      <w:tr>
+        <w:trPr>
+          <w:cantSplit/>
+        </w:trPr>
+        <w:tc>
+          <w:tcPr>
+            <w:tcW w:type="dxa" w:w="7632"/>
+            <w:vAlign w:val="center"/>
+          </w:tcPr>
+          <w:p>
+            <w:pPr>
+              <w:spacing w:after="0"/>
+            </w:pPr>
+            <w:r>
+              <w:rPr>
+                <w:b/>
+                <w:color w:val="1A2336"/>
+                <w:sz w:val="19"/>
+              </w:rPr>
+              <w:t>West Freeway Church Website Infrastructure | Volunteer Webmaster / Infrastructure Administrator</w:t>
+            </w:r>
+          </w:p>
+        </w:tc>
+        <w:tc>
+          <w:tcPr>
+            <w:tcW w:type="dxa" w:w="2448"/>
+            <w:vAlign w:val="center"/>
+          </w:tcPr>
+          <w:p>
+            <w:pPr>
+              <w:spacing w:after="0"/>
+              <w:jc w:val="right"/>
+            </w:pPr>
+            <w:r>
+              <w:rPr>
+                <w:b/>
+                <w:color w:val="555B65"/>
+                <w:sz w:val="18"/>
+              </w:rPr>
+              <w:t>Active</w:t>
+            </w:r>
+          </w:p>
+        </w:tc>
+      </w:tr>
+    </w:tbl>
+    <w:p>
+      <w:pPr>
+        <w:spacing w:after="24"/>
+        <w:ind w:left="202" w:hanging="173"/>
+      </w:pPr>
+      <w:r>
+        <w:rPr>
+          <w:b/>
+        </w:rPr>
+        <w:t xml:space="preserve">• </w:t>
+      </w:r>
+      <w:r>
+        <w:t>Designed and deployed a beta church website platform using Ubuntu Server, Nginx, ASP.NET Core, Umbraco CMS, SQLite, and systemd while maintaining the legacy production site.</w:t>
       </w:r>
     </w:p>
     <w:p>
       <w:pPr>
-        <w:pStyle w:val="Heading3"/>
+        <w:spacing w:after="24"/>
+        <w:ind w:left="202" w:hanging="173"/>
       </w:pPr>
       <w:r>
-        <w:t>Amentum – End User Support Specialist</w:t>
+        <w:rPr>
+          <w:b/>
+        </w:rPr>
+        <w:t xml:space="preserve">• </w:t>
+      </w:r>
+      <w:r>
+        <w:t>Implemented integrations, operational monitoring, automated nightly database backups with integrity verification, and documented recovery and deployment procedures.</w:t>
       </w:r>
     </w:p>
+    <w:tbl>
+      <w:tblPr>
+        <w:tblW w:type="auto" w:w="0"/>
+        <w:jc w:val="center"/>
+        <w:tblLayout w:type="fixed"/>
+        <w:tblLook w:firstColumn="1" w:firstRow="1" w:lastColumn="0" w:lastRow="0" w:noHBand="0" w:noVBand="1" w:val="04A0"/>
+      </w:tblPr>
+      <w:tblGrid>
+        <w:gridCol w:w="7632"/>
+        <w:gridCol w:w="2448"/>
+      </w:tblGrid>
+      <w:tr>
+        <w:trPr>
+          <w:cantSplit/>
+        </w:trPr>
+        <w:tc>
+          <w:tcPr>
+            <w:tcW w:type="dxa" w:w="7632"/>
+            <w:vAlign w:val="center"/>
+          </w:tcPr>
+          <w:p>
+            <w:pPr>
+              <w:spacing w:after="0"/>
+            </w:pPr>
+            <w:r>
+              <w:rPr>
+                <w:b/>
+                <w:color w:val="1A2336"/>
+                <w:sz w:val="19"/>
+              </w:rPr>
+              <w:t>Professional Email Infrastructure | Independent Project</w:t>
+            </w:r>
+          </w:p>
+        </w:tc>
+        <w:tc>
+          <w:tcPr>
+            <w:tcW w:type="dxa" w:w="2448"/>
+            <w:vAlign w:val="center"/>
+          </w:tcPr>
+          <w:p>
+            <w:pPr>
+              <w:spacing w:after="0"/>
+              <w:jc w:val="right"/>
+            </w:pPr>
+            <w:r>
+              <w:rPr>
+                <w:b/>
+                <w:color w:val="555B65"/>
+                <w:sz w:val="18"/>
+              </w:rPr>
+              <w:t>Complete</w:t>
+            </w:r>
+          </w:p>
+        </w:tc>
+      </w:tr>
+    </w:tbl>
     <w:p>
+      <w:pPr>
+        <w:spacing w:after="24"/>
+        <w:ind w:left="202" w:hanging="173"/>
+      </w:pPr>
       <w:r>
-        <w:t>October 2020 – June 2021</w:t>
+        <w:rPr>
+          <w:b/>
+        </w:rPr>
+        <w:t xml:space="preserve">• </w:t>
+      </w:r>
+      <w:r>
+        <w:t>Designed and secured a custom email platform using Zoho Mail and managed DNS, including MX, SPF, DKIM, and DMARC configuration.</w:t>
       </w:r>
     </w:p>
     <w:p>
       <w:pPr>
-        <w:pStyle w:val="ListBullet"/>
+        <w:pStyle w:val="SectionHeading"/>
+        <w:keepNext/>
+        <w:pBdr>
+          <w:bottom w:val="single" w:sz="10" w:space="1" w:color="22547E"/>
+        </w:pBdr>
       </w:pPr>
       <w:r>
-        <w:t>Supported over 1,000 global employees across Windows workstations, Microsoft 365, Azure Active Directory, and enterprise applications.</w:t>
+        <w:t>EDUCATION &amp; CERTIFICATIONS</w:t>
       </w:r>
     </w:p>
-    <w:p>
-      <w:pPr>
-        <w:pStyle w:val="ListBullet"/>
-      </w:pPr>
-      <w:r>
-        <w:t>Provisioned Active Directory and Microsoft 365 accounts using PowerShell automation.</w:t>
-      </w:r>
-    </w:p>
-    <w:p>
-      <w:pPr>
-        <w:pStyle w:val="ListBullet"/>
-      </w:pPr>
-      <w:r>
-        <w:t>Managed mobile devices using VMware AirWatch.</w:t>
-      </w:r>
-    </w:p>
-    <w:p>
-      <w:pPr>
-        <w:pStyle w:val="ListBullet"/>
-      </w:pPr>
-      <w:r>
-        <w:t>Configured Cisco IP phones within the enterprise Unified Communications environment.</w:t>
-      </w:r>
-    </w:p>
-    <w:p>
-      <w:pPr>
-        <w:pStyle w:val="ListBullet"/>
-      </w:pPr>
-      <w:r>
-        <w:t>Installed software, resolved hardware failures, and supported multi-factor authentication.</w:t>
-      </w:r>
-    </w:p>
-    <w:p>
-      <w:pPr>
-        <w:pStyle w:val="Heading3"/>
-      </w:pPr>
-      <w:r>
-        <w:t>Bank of America – Technical Support III</w:t>
-      </w:r>
-    </w:p>
-    <w:p>
-      <w:r>
-        <w:t>April 2020 – October 2020</w:t>
-      </w:r>
-    </w:p>
-    <w:p>
-      <w:pPr>
-        <w:pStyle w:val="ListBullet"/>
-      </w:pPr>
-      <w:r>
-        <w:t>Delivered advanced support for enterprise laptops, virtual machines, and Chromebooks.</w:t>
-      </w:r>
-    </w:p>
-    <w:p>
-      <w:pPr>
-        <w:pStyle w:val="ListBullet"/>
-      </w:pPr>
-      <w:r>
-        <w:t>Resolved Level II technical issues using BMC Remedy and remote support tools.</w:t>
-      </w:r>
-    </w:p>
-    <w:p>
-      <w:pPr>
-        <w:pStyle w:val="ListBullet"/>
-      </w:pPr>
-      <w:r>
-        <w:t>Assisted users with hardware, software, and business application issues.</w:t>
-      </w:r>
-    </w:p>
-    <w:p>
-      <w:pPr>
-        <w:pStyle w:val="Heading3"/>
-      </w:pPr>
-      <w:r>
-        <w:t>Amynta Group – Service Desk Analyst I</w:t>
-      </w:r>
-    </w:p>
-    <w:p>
-      <w:r>
-        <w:t>July 2018 – March 2020</w:t>
-      </w:r>
-    </w:p>
-    <w:p>
-      <w:pPr>
-        <w:pStyle w:val="ListBullet"/>
-      </w:pPr>
-      <w:r>
-        <w:t>Provided technical support for Windows desktop systems, Active Directory user accounts, printers, and business applications.</w:t>
-      </w:r>
-    </w:p>
-    <w:p>
-      <w:pPr>
-        <w:pStyle w:val="ListBullet"/>
-      </w:pPr>
-      <w:r>
-        <w:t>Managed and routed ServiceNow incidents to appropriate support teams.</w:t>
-      </w:r>
-    </w:p>
-    <w:p>
-      <w:pPr>
-        <w:pStyle w:val="ListBullet"/>
-      </w:pPr>
-      <w:r>
-        <w:t>Assisted in the successful deployment of more than 600 Windows 10 workstations.</w:t>
-      </w:r>
-    </w:p>
-    <w:p>
-      <w:pPr>
-        <w:pStyle w:val="ListBullet"/>
-      </w:pPr>
-      <w:r>
-        <w:t>Created documentation to improve knowledge sharing and issue resolution consistency.</w:t>
-      </w:r>
-    </w:p>
-    <w:p>
-      <w:pPr>
-        <w:pStyle w:val="Heading2"/>
-      </w:pPr>
-      <w:r>
-        <w:t>HOME LAB</w:t>
-      </w:r>
-    </w:p>
-    <w:p>
-      <w:pPr>
-        <w:pStyle w:val="ListBullet"/>
-      </w:pPr>
-      <w:r>
-        <w:t>Built and maintain a Proxmox virtualization environment hosting Windows Server and Linux virtual machines.</w:t>
-      </w:r>
-    </w:p>
-    <w:p>
-      <w:pPr>
-        <w:pStyle w:val="ListBullet"/>
-      </w:pPr>
-      <w:r>
-        <w:t>Deployed Active Directory Domain Services, DNS, DHCP, and Group Policy in a simulated enterprise environment.</w:t>
-      </w:r>
-    </w:p>
-    <w:p>
-      <w:pPr>
-        <w:pStyle w:val="ListBullet"/>
-      </w:pPr>
-      <w:r>
-        <w:t>Implemented pfSense firewall services and segmented virtual networks for infrastructure testing.</w:t>
-      </w:r>
-    </w:p>
-    <w:p>
-      <w:pPr>
-        <w:pStyle w:val="ListBullet"/>
-      </w:pPr>
-      <w:r>
-        <w:t>Practice Windows Server administration, user management, system updates, backup, and troubleshooting.</w:t>
-      </w:r>
-    </w:p>
-    <w:p>
-      <w:pPr>
-        <w:pStyle w:val="Heading2"/>
-      </w:pPr>
-      <w:r>
-        <w:t>EDUCATION</w:t>
-      </w:r>
-    </w:p>
-    <w:p>
-      <w:r>
-        <w:t>Bachelor of Science</w:t>
-        <w:br/>
-        <w:t>Network Operations &amp; Security</w:t>
-        <w:br/>
-        <w:t>Western Governors University</w:t>
-      </w:r>
-    </w:p>
-    <w:p>
-      <w:pPr>
-        <w:pStyle w:val="Heading2"/>
-      </w:pPr>
-      <w:r>
-        <w:t>CERTIFICATIONS</w:t>
-      </w:r>
-    </w:p>
-    <w:p>
-      <w:pPr>
-        <w:pStyle w:val="ListBullet"/>
-      </w:pPr>
-      <w:r>
-        <w:t>Cisco Certified Network Associate (CCNA)</w:t>
-      </w:r>
-    </w:p>
-    <w:p>
-      <w:pPr>
-        <w:pStyle w:val="ListBullet"/>
-      </w:pPr>
-      <w:r>
-        <w:t>CompTIA Security+</w:t>
-      </w:r>
-    </w:p>
-    <w:p>
-      <w:pPr>
-        <w:pStyle w:val="ListBullet"/>
-      </w:pPr>
-      <w:r>
-        <w:t>Microsoft Azure Fundamentals (AZ-900)</w:t>
-      </w:r>
-    </w:p>
-    <w:p>
-      <w:pPr>
-        <w:pStyle w:val="ListBullet"/>
-      </w:pPr>
-      <w:r>
-        <w:t>LPI Linux Essentials</w:t>
-      </w:r>
-    </w:p>
+    <w:tbl>
+      <w:tblPr>
+        <w:tblW w:type="auto" w:w="0"/>
+        <w:jc w:val="center"/>
+        <w:tblLayout w:type="fixed"/>
+        <w:tblLook w:firstColumn="1" w:firstRow="1" w:lastColumn="0" w:lastRow="0" w:noHBand="0" w:noVBand="1" w:val="04A0"/>
+      </w:tblPr>
+      <w:tblGrid>
+        <w:gridCol w:w="5328"/>
+        <w:gridCol w:w="5328"/>
+      </w:tblGrid>
+      <w:tr>
+        <w:trPr>
+          <w:cantSplit/>
+        </w:trPr>
+        <w:tc>
+          <w:tcPr>
+            <w:tcW w:type="dxa" w:w="5472"/>
+          </w:tcPr>
+          <w:p>
+            <w:pPr>
+              <w:spacing w:after="20"/>
+            </w:pPr>
+            <w:r>
+              <w:rPr>
+                <w:b/>
+                <w:color w:val="1A2336"/>
+              </w:rPr>
+              <w:t>Western Governors University</w:t>
+            </w:r>
+            <w:r>
+              <w:br/>
+              <w:t>M.S., Cybersecurity and Information Assurance — In Progress</w:t>
+              <w:br/>
+              <w:t>B.S., Network Operations and Security — 2024</w:t>
+            </w:r>
+          </w:p>
+        </w:tc>
+        <w:tc>
+          <w:tcPr>
+            <w:tcW w:type="dxa" w:w="4608"/>
+          </w:tcPr>
+          <w:p>
+            <w:pPr>
+              <w:spacing w:after="20"/>
+            </w:pPr>
+            <w:r>
+              <w:rPr>
+                <w:b/>
+                <w:color w:val="1A2336"/>
+              </w:rPr>
+              <w:t>Certifications</w:t>
+            </w:r>
+            <w:r>
+              <w:br/>
+              <w:t>CCNA  •  CompTIA Security+</w:t>
+              <w:br/>
+              <w:t>Microsoft Azure Fundamentals (AZ-900)</w:t>
+              <w:br/>
+              <w:t>LPI Linux Essentials</w:t>
+            </w:r>
+          </w:p>
+        </w:tc>
+      </w:tr>
+    </w:tbl>
     <w:sectPr>
+      <w:footerReference w:type="default" r:id="rId9"/>
       <w:pgSz w:w="12240" w:h="15840"/>
-      <w:pgMar w:top="1440" w:right="1800" w:bottom="1440" w:left="1800" w:header="720" w:footer="720" w:gutter="0"/>
+      <w:pgMar w:top="605" w:right="792" w:bottom="605" w:left="792" w:header="720" w:footer="720" w:gutter="0"/>
       <w:cols w:space="720"/>
       <w:docGrid w:linePitch="360"/>
     </w:sectPr>
   </w:body>
 </w:document>
+</file>
+
+<file path=word/footer1.xml><?xml version="1.0" encoding="utf-8"?>
+<w:ftr xmlns:m="http://schemas.openxmlformats.org/officeDocument/2006/math" xmlns:mc="http://schemas.openxmlformats.org/markup-compatibility/2006" xmlns:mo="http://schemas.microsoft.com/office/mac/office/2008/main" xmlns:mv="urn:schemas-microsoft-com:mac:vml" xmlns:o="urn:schemas-microsoft-com:office:office" xmlns:r="http://schemas.openxmlformats.org/officeDocument/2006/relationships" xmlns:v="urn:schemas-microsoft-com:vml" xmlns:w10="urn:schemas-microsoft-com:office:word" xmlns:w14="http://schemas.microsoft.com/office/word/2010/wordml" xmlns:w="http://schemas.openxmlformats.org/wordprocessingml/2006/main" xmlns:wne="http://schemas.microsoft.com/office/word/2006/wordml" xmlns:wp14="http://schemas.microsoft.com/office/word/2010/wordprocessingDrawing" xmlns:wp="http://schemas.openxmlformats.org/drawingml/2006/wordprocessingDrawing" xmlns:wpc="http://schemas.microsoft.com/office/word/2010/wordprocessingCanvas" xmlns:wpg="http://schemas.microsoft.com/office/word/2010/wordprocessingGroup" xmlns:wpi="http://schemas.microsoft.com/office/word/2010/wordprocessingInk" xmlns:wps="http://schemas.microsoft.com/office/word/2010/wordprocessingShape" mc:Ignorable="w14 wp14">
+  <w:p>
+    <w:pPr>
+      <w:pStyle w:val="Footer"/>
+      <w:jc w:val="center"/>
+    </w:pPr>
+    <w:r>
+      <w:rPr>
+        <w:color w:val="555B65"/>
+        <w:sz w:val="16"/>
+      </w:rPr>
+      <w:t>Jeremy Cain  |  IT Operations · Systems Administration · Identity</w:t>
+    </w:r>
+  </w:p>
+</w:ftr>
 </file>
 
 <file path=word/numbering.xml><?xml version="1.0" encoding="utf-8"?>
@@ -784,6 +1368,13 @@
     <w:name w:val="Normal"/>
     <w:qFormat/>
     <w:rsid w:val="00FC693F"/>
+    <w:pPr>
+      <w:spacing w:after="30" w:line="240" w:lineRule="auto"/>
+    </w:pPr>
+    <w:rPr>
+      <w:rFonts w:ascii="Aptos" w:hAnsi="Aptos"/>
+      <w:sz w:val="18"/>
+    </w:rPr>
   </w:style>
   <w:style w:type="paragraph" w:styleId="Header">
     <w:name w:val="header"/>
@@ -12466,6 +13057,30 @@
         <w:shd w:val="clear" w:color="auto" w:fill="FBCAA2" w:themeFill="accent6" w:themeFillTint="7F"/>
       </w:tcPr>
     </w:tblStylePr>
+  </w:style>
+  <w:style w:type="paragraph" w:customStyle="1" w:styleId="SectionHeading">
+    <w:name w:val="Section Heading"/>
+    <w:pPr>
+      <w:spacing w:before="80" w:after="40"/>
+    </w:pPr>
+    <w:rPr>
+      <w:rFonts w:ascii="Aptos" w:hAnsi="Aptos"/>
+      <w:b/>
+      <w:color w:val="1A2336"/>
+      <w:sz w:val="21"/>
+    </w:rPr>
+  </w:style>
+  <w:style w:type="paragraph" w:customStyle="1" w:styleId="JobHeading">
+    <w:name w:val="Job Heading"/>
+    <w:pPr>
+      <w:spacing w:before="80" w:after="40"/>
+    </w:pPr>
+    <w:rPr>
+      <w:rFonts w:ascii="Aptos" w:hAnsi="Aptos"/>
+      <w:b/>
+      <w:color w:val="1A2336"/>
+      <w:sz w:val="19"/>
+    </w:rPr>
   </w:style>
 </w:styles>
 </file>

</xml_diff>